<commit_message>
laaste aanpasing huidige tijd & kaart klikbaar
</commit_message>
<xml_diff>
--- a/documenten/Logboek.docx
+++ b/documenten/Logboek.docx
@@ -21,6 +21,12 @@
           <w:rFonts w:ascii="Arial" w:hAnsi="Arial" w:cs="Arial"/>
         </w:rPr>
         <w:t>24-04-26</w:t>
+      </w:r>
+      <w:r>
+        <w:rPr>
+          <w:rFonts w:ascii="Arial" w:hAnsi="Arial" w:cs="Arial"/>
+        </w:rPr>
+        <w:t xml:space="preserve"> 9:30-12:45</w:t>
       </w:r>
     </w:p>
     <w:p>

</xml_diff>